<commit_message>
Update secretary generator templates and workflow
</commit_message>
<xml_diff>
--- a/app/doc_templates/p1_standard_v3_part1/01_first_directors_resolution_standard.docx
+++ b/app/doc_templates/p1_standard_v3_part1/01_first_directors_resolution_standard.docx
@@ -109,13 +109,14 @@
       </w:r>
     </w:p>
     <w:p>
+      <w:pPr/>
       <w:r>
         <w:rPr>
-          <w:rFonts w:ascii="Arial" w:hAnsi="Arial" w:eastAsia="Microsoft YaHei"/>
+          <w:rFonts w:ascii="Arial" w:hAnsi="Arial"/>
           <w:b w:val="0"/>
           <w:i w:val="0"/>
         </w:rPr>
-        <w:t>The Certificate numbered {{company.incorporation_certificate_no}} confirming Incorporation of Company on {{company.incorporation_date}} together with a copy of the Constitution of the Company.</w:t>
+        <w:t>The electronic certificate confirming Incorporation of Company on {{company.incorporation_date}} together with a copy of the Constitution of the Company was noted.</w:t>
       </w:r>
     </w:p>
     <w:p>

</xml_diff>